<commit_message>
Plan d'entraînement : repères du marché et réentraînement automatique quotidien
Ajoute au plan (et à Memoire.md §35) les repères mesurés sur les vraies données (marge 3,4 % MKX,
7,6 % MK3, marché bien calibré, backtest de la martingale perdant dans les 12 variantes), le
calendrier réaliste d'un modèle fiable, et la décision de réentraîner et redéployer le modèle
chaque jour automatiquement, uniquement via un examen de passage champion/challenger.

Co-Authored-By: Claude Opus 5.5 <noreply@anthropic.com>
</commit_message>
<xml_diff>
--- a/docs/forecasting/plan_entrainement_mortal_kombat.docx
+++ b/docs/forecasting/plan_entrainement_mortal_kombat.docx
@@ -75,7 +75,7 @@
           <w:sz w:val="20"/>
           <w:szCs w:val="20"/>
         </w:rPr>
-        <w:t xml:space="preserve">22 septembre 2026</w:t>
+        <w:t xml:space="preserve">22 septembre 2026 — mis à jour le 24 septembre 2026</w:t>
       </w:r>
     </w:p>
     <w:p>
@@ -3121,6 +3121,475 @@
     </w:p>
     <w:p>
       <w:pPr>
+        <w:pStyle w:val="Heading2"/>
+        <w:spacing w:after="150" w:before="300"/>
+      </w:pPr>
+      <w:r>
+        <w:rPr>
+          <w:rFonts w:ascii="Calibri" w:cs="Calibri" w:eastAsia="Calibri" w:hAnsi="Calibri"/>
+          <w:b/>
+          <w:bCs/>
+          <w:color w:val="2F2A2E"/>
+        </w:rPr>
+        <w:t xml:space="preserve">8.3 Repères mesurés sur le marché (24 septembre 2026)</w:t>
+      </w:r>
+    </w:p>
+    <w:p>
+      <w:pPr>
+        <w:spacing w:after="160"/>
+      </w:pPr>
+      <w:r>
+        <w:rPr>
+          <w:rFonts w:ascii="Calibri" w:cs="Calibri" w:eastAsia="Calibri" w:hAnsi="Calibri"/>
+          <w:b w:val="false"/>
+          <w:bCs w:val="false"/>
+          <w:i w:val="false"/>
+          <w:iCs w:val="false"/>
+        </w:rPr>
+        <w:t xml:space="preserve">Mesuré sur ≈ 8 600 manches réelles (22 au 24 septembre), marché « Victoire dans le Round » (groupe 1050), cote de clôture de chaque manche :</w:t>
+      </w:r>
+    </w:p>
+    <w:tbl>
+      <w:tblPr>
+        <w:tblW w:type="dxa" w:w="8600"/>
+        <w:tblBorders>
+          <w:top w:val="single" w:color="auto" w:sz="4"/>
+          <w:left w:val="single" w:color="auto" w:sz="4"/>
+          <w:bottom w:val="single" w:color="auto" w:sz="4"/>
+          <w:right w:val="single" w:color="auto" w:sz="4"/>
+          <w:insideH w:val="single" w:color="auto" w:sz="4"/>
+          <w:insideV w:val="single" w:color="auto" w:sz="4"/>
+        </w:tblBorders>
+      </w:tblPr>
+      <w:tblGrid>
+        <w:gridCol w:w="3600"/>
+        <w:gridCol w:w="2500"/>
+        <w:gridCol w:w="2500"/>
+      </w:tblGrid>
+      <w:tr>
+        <w:tc>
+          <w:tcPr>
+            <w:tcW w:type="dxa" w:w="3600"/>
+            <w:shd w:fill="8B1A1A" w:val="clear"/>
+            <w:tcMar>
+              <w:top w:type="dxa" w:w="80"/>
+              <w:left w:type="dxa" w:w="100"/>
+              <w:bottom w:type="dxa" w:w="80"/>
+              <w:right w:type="dxa" w:w="100"/>
+            </w:tcMar>
+            <w:vAlign w:val="center"/>
+          </w:tcPr>
+          <w:p>
+            <w:r>
+              <w:rPr>
+                <w:rFonts w:ascii="Calibri" w:cs="Calibri" w:eastAsia="Calibri" w:hAnsi="Calibri"/>
+                <w:b/>
+                <w:bCs/>
+                <w:color w:val="FFFFFF"/>
+                <w:sz w:val="19"/>
+                <w:szCs w:val="19"/>
+              </w:rPr>
+              <w:t xml:space="preserve">Repère</w:t>
+            </w:r>
+          </w:p>
+        </w:tc>
+        <w:tc>
+          <w:tcPr>
+            <w:tcW w:type="dxa" w:w="2500"/>
+            <w:shd w:fill="8B1A1A" w:val="clear"/>
+            <w:tcMar>
+              <w:top w:type="dxa" w:w="80"/>
+              <w:left w:type="dxa" w:w="100"/>
+              <w:bottom w:type="dxa" w:w="80"/>
+              <w:right w:type="dxa" w:w="100"/>
+            </w:tcMar>
+            <w:vAlign w:val="center"/>
+          </w:tcPr>
+          <w:p>
+            <w:r>
+              <w:rPr>
+                <w:rFonts w:ascii="Calibri" w:cs="Calibri" w:eastAsia="Calibri" w:hAnsi="Calibri"/>
+                <w:b/>
+                <w:bCs/>
+                <w:color w:val="FFFFFF"/>
+                <w:sz w:val="19"/>
+                <w:szCs w:val="19"/>
+              </w:rPr>
+              <w:t xml:space="preserve">Mortal Kombat X</w:t>
+            </w:r>
+          </w:p>
+        </w:tc>
+        <w:tc>
+          <w:tcPr>
+            <w:tcW w:type="dxa" w:w="2500"/>
+            <w:shd w:fill="8B1A1A" w:val="clear"/>
+            <w:tcMar>
+              <w:top w:type="dxa" w:w="80"/>
+              <w:left w:type="dxa" w:w="100"/>
+              <w:bottom w:type="dxa" w:w="80"/>
+              <w:right w:type="dxa" w:w="100"/>
+            </w:tcMar>
+            <w:vAlign w:val="center"/>
+          </w:tcPr>
+          <w:p>
+            <w:r>
+              <w:rPr>
+                <w:rFonts w:ascii="Calibri" w:cs="Calibri" w:eastAsia="Calibri" w:hAnsi="Calibri"/>
+                <w:b/>
+                <w:bCs/>
+                <w:color w:val="FFFFFF"/>
+                <w:sz w:val="19"/>
+                <w:szCs w:val="19"/>
+              </w:rPr>
+              <w:t xml:space="preserve">Mortal Kombat 3</w:t>
+            </w:r>
+          </w:p>
+        </w:tc>
+      </w:tr>
+      <w:tr>
+        <w:tc>
+          <w:tcPr>
+            <w:tcW w:type="dxa" w:w="3600"/>
+            <w:tcMar>
+              <w:top w:type="dxa" w:w="80"/>
+              <w:left w:type="dxa" w:w="100"/>
+              <w:bottom w:type="dxa" w:w="80"/>
+              <w:right w:type="dxa" w:w="100"/>
+            </w:tcMar>
+            <w:vAlign w:val="center"/>
+          </w:tcPr>
+          <w:p>
+            <w:r>
+              <w:rPr>
+                <w:rFonts w:ascii="Calibri" w:cs="Calibri" w:eastAsia="Calibri" w:hAnsi="Calibri"/>
+                <w:b w:val="false"/>
+                <w:bCs w:val="false"/>
+                <w:color w:val="000000"/>
+                <w:sz w:val="19"/>
+                <w:szCs w:val="19"/>
+              </w:rPr>
+              <w:t xml:space="preserve">Marge moyenne du bookmaker</w:t>
+            </w:r>
+          </w:p>
+        </w:tc>
+        <w:tc>
+          <w:tcPr>
+            <w:tcW w:type="dxa" w:w="2500"/>
+            <w:tcMar>
+              <w:top w:type="dxa" w:w="80"/>
+              <w:left w:type="dxa" w:w="100"/>
+              <w:bottom w:type="dxa" w:w="80"/>
+              <w:right w:type="dxa" w:w="100"/>
+            </w:tcMar>
+            <w:vAlign w:val="center"/>
+          </w:tcPr>
+          <w:p>
+            <w:r>
+              <w:rPr>
+                <w:rFonts w:ascii="Calibri" w:cs="Calibri" w:eastAsia="Calibri" w:hAnsi="Calibri"/>
+                <w:b w:val="false"/>
+                <w:bCs w:val="false"/>
+                <w:color w:val="000000"/>
+                <w:sz w:val="19"/>
+                <w:szCs w:val="19"/>
+              </w:rPr>
+              <w:t xml:space="preserve">3,4 %</w:t>
+            </w:r>
+          </w:p>
+        </w:tc>
+        <w:tc>
+          <w:tcPr>
+            <w:tcW w:type="dxa" w:w="2500"/>
+            <w:tcMar>
+              <w:top w:type="dxa" w:w="80"/>
+              <w:left w:type="dxa" w:w="100"/>
+              <w:bottom w:type="dxa" w:w="80"/>
+              <w:right w:type="dxa" w:w="100"/>
+            </w:tcMar>
+            <w:vAlign w:val="center"/>
+          </w:tcPr>
+          <w:p>
+            <w:r>
+              <w:rPr>
+                <w:rFonts w:ascii="Calibri" w:cs="Calibri" w:eastAsia="Calibri" w:hAnsi="Calibri"/>
+                <w:b w:val="false"/>
+                <w:bCs w:val="false"/>
+                <w:color w:val="000000"/>
+                <w:sz w:val="19"/>
+                <w:szCs w:val="19"/>
+              </w:rPr>
+              <w:t xml:space="preserve">7,6 %</w:t>
+            </w:r>
+          </w:p>
+        </w:tc>
+      </w:tr>
+      <w:tr>
+        <w:tc>
+          <w:tcPr>
+            <w:tcW w:type="dxa" w:w="3600"/>
+            <w:tcMar>
+              <w:top w:type="dxa" w:w="80"/>
+              <w:left w:type="dxa" w:w="100"/>
+              <w:bottom w:type="dxa" w:w="80"/>
+              <w:right w:type="dxa" w:w="100"/>
+            </w:tcMar>
+            <w:vAlign w:val="center"/>
+          </w:tcPr>
+          <w:p>
+            <w:r>
+              <w:rPr>
+                <w:rFonts w:ascii="Calibri" w:cs="Calibri" w:eastAsia="Calibri" w:hAnsi="Calibri"/>
+                <w:b w:val="false"/>
+                <w:bCs w:val="false"/>
+                <w:color w:val="000000"/>
+                <w:sz w:val="19"/>
+                <w:szCs w:val="19"/>
+              </w:rPr>
+              <w:t xml:space="preserve">Le favori gagne réellement</w:t>
+            </w:r>
+          </w:p>
+        </w:tc>
+        <w:tc>
+          <w:tcPr>
+            <w:tcW w:type="dxa" w:w="2500"/>
+            <w:tcMar>
+              <w:top w:type="dxa" w:w="80"/>
+              <w:left w:type="dxa" w:w="100"/>
+              <w:bottom w:type="dxa" w:w="80"/>
+              <w:right w:type="dxa" w:w="100"/>
+            </w:tcMar>
+            <w:vAlign w:val="center"/>
+          </w:tcPr>
+          <w:p>
+            <w:r>
+              <w:rPr>
+                <w:rFonts w:ascii="Calibri" w:cs="Calibri" w:eastAsia="Calibri" w:hAnsi="Calibri"/>
+                <w:b w:val="false"/>
+                <w:bCs w:val="false"/>
+                <w:color w:val="000000"/>
+                <w:sz w:val="19"/>
+                <w:szCs w:val="19"/>
+              </w:rPr>
+              <w:t xml:space="preserve">60,0 % des manches</w:t>
+            </w:r>
+          </w:p>
+        </w:tc>
+        <w:tc>
+          <w:tcPr>
+            <w:tcW w:type="dxa" w:w="2500"/>
+            <w:tcMar>
+              <w:top w:type="dxa" w:w="80"/>
+              <w:left w:type="dxa" w:w="100"/>
+              <w:bottom w:type="dxa" w:w="80"/>
+              <w:right w:type="dxa" w:w="100"/>
+            </w:tcMar>
+            <w:vAlign w:val="center"/>
+          </w:tcPr>
+          <w:p>
+            <w:r>
+              <w:rPr>
+                <w:rFonts w:ascii="Calibri" w:cs="Calibri" w:eastAsia="Calibri" w:hAnsi="Calibri"/>
+                <w:b w:val="false"/>
+                <w:bCs w:val="false"/>
+                <w:color w:val="000000"/>
+                <w:sz w:val="19"/>
+                <w:szCs w:val="19"/>
+              </w:rPr>
+              <w:t xml:space="preserve">59,6 % des manches</w:t>
+            </w:r>
+          </w:p>
+        </w:tc>
+      </w:tr>
+      <w:tr>
+        <w:tc>
+          <w:tcPr>
+            <w:tcW w:type="dxa" w:w="3600"/>
+            <w:tcMar>
+              <w:top w:type="dxa" w:w="80"/>
+              <w:left w:type="dxa" w:w="100"/>
+              <w:bottom w:type="dxa" w:w="80"/>
+              <w:right w:type="dxa" w:w="100"/>
+            </w:tcMar>
+            <w:vAlign w:val="center"/>
+          </w:tcPr>
+          <w:p>
+            <w:r>
+              <w:rPr>
+                <w:rFonts w:ascii="Calibri" w:cs="Calibri" w:eastAsia="Calibri" w:hAnsi="Calibri"/>
+                <w:b w:val="false"/>
+                <w:bCs w:val="false"/>
+                <w:color w:val="000000"/>
+                <w:sz w:val="19"/>
+                <w:szCs w:val="19"/>
+              </w:rPr>
+              <w:t xml:space="preserve">Probabilité implicite du favori (marge retirée)</w:t>
+            </w:r>
+          </w:p>
+        </w:tc>
+        <w:tc>
+          <w:tcPr>
+            <w:tcW w:type="dxa" w:w="2500"/>
+            <w:tcMar>
+              <w:top w:type="dxa" w:w="80"/>
+              <w:left w:type="dxa" w:w="100"/>
+              <w:bottom w:type="dxa" w:w="80"/>
+              <w:right w:type="dxa" w:w="100"/>
+            </w:tcMar>
+            <w:vAlign w:val="center"/>
+          </w:tcPr>
+          <w:p>
+            <w:r>
+              <w:rPr>
+                <w:rFonts w:ascii="Calibri" w:cs="Calibri" w:eastAsia="Calibri" w:hAnsi="Calibri"/>
+                <w:b w:val="false"/>
+                <w:bCs w:val="false"/>
+                <w:color w:val="000000"/>
+                <w:sz w:val="19"/>
+                <w:szCs w:val="19"/>
+              </w:rPr>
+              <w:t xml:space="preserve">59,2 %</w:t>
+            </w:r>
+          </w:p>
+        </w:tc>
+        <w:tc>
+          <w:tcPr>
+            <w:tcW w:type="dxa" w:w="2500"/>
+            <w:tcMar>
+              <w:top w:type="dxa" w:w="80"/>
+              <w:left w:type="dxa" w:w="100"/>
+              <w:bottom w:type="dxa" w:w="80"/>
+              <w:right w:type="dxa" w:w="100"/>
+            </w:tcMar>
+            <w:vAlign w:val="center"/>
+          </w:tcPr>
+          <w:p>
+            <w:r>
+              <w:rPr>
+                <w:rFonts w:ascii="Calibri" w:cs="Calibri" w:eastAsia="Calibri" w:hAnsi="Calibri"/>
+                <w:b w:val="false"/>
+                <w:bCs w:val="false"/>
+                <w:color w:val="000000"/>
+                <w:sz w:val="19"/>
+                <w:szCs w:val="19"/>
+              </w:rPr>
+              <w:t xml:space="preserve">59,0 %</w:t>
+            </w:r>
+          </w:p>
+        </w:tc>
+      </w:tr>
+      <w:tr>
+        <w:tc>
+          <w:tcPr>
+            <w:tcW w:type="dxa" w:w="3600"/>
+            <w:tcMar>
+              <w:top w:type="dxa" w:w="80"/>
+              <w:left w:type="dxa" w:w="100"/>
+              <w:bottom w:type="dxa" w:w="80"/>
+              <w:right w:type="dxa" w:w="100"/>
+            </w:tcMar>
+            <w:vAlign w:val="center"/>
+          </w:tcPr>
+          <w:p>
+            <w:r>
+              <w:rPr>
+                <w:rFonts w:ascii="Calibri" w:cs="Calibri" w:eastAsia="Calibri" w:hAnsi="Calibri"/>
+                <w:b w:val="false"/>
+                <w:bCs w:val="false"/>
+                <w:color w:val="000000"/>
+                <w:sz w:val="19"/>
+                <w:szCs w:val="19"/>
+              </w:rPr>
+              <w:t xml:space="preserve">Cote médiane du favori / de l'outsider</w:t>
+            </w:r>
+          </w:p>
+        </w:tc>
+        <w:tc>
+          <w:tcPr>
+            <w:tcW w:type="dxa" w:w="2500"/>
+            <w:tcMar>
+              <w:top w:type="dxa" w:w="80"/>
+              <w:left w:type="dxa" w:w="100"/>
+              <w:bottom w:type="dxa" w:w="80"/>
+              <w:right w:type="dxa" w:w="100"/>
+            </w:tcMar>
+            <w:vAlign w:val="center"/>
+          </w:tcPr>
+          <w:p>
+            <w:r>
+              <w:rPr>
+                <w:rFonts w:ascii="Calibri" w:cs="Calibri" w:eastAsia="Calibri" w:hAnsi="Calibri"/>
+                <w:b w:val="false"/>
+                <w:bCs w:val="false"/>
+                <w:color w:val="000000"/>
+                <w:sz w:val="19"/>
+                <w:szCs w:val="19"/>
+              </w:rPr>
+              <w:t xml:space="preserve">1,69 / 2,28</w:t>
+            </w:r>
+          </w:p>
+        </w:tc>
+        <w:tc>
+          <w:tcPr>
+            <w:tcW w:type="dxa" w:w="2500"/>
+            <w:tcMar>
+              <w:top w:type="dxa" w:w="80"/>
+              <w:left w:type="dxa" w:w="100"/>
+              <w:bottom w:type="dxa" w:w="80"/>
+              <w:right w:type="dxa" w:w="100"/>
+            </w:tcMar>
+            <w:vAlign w:val="center"/>
+          </w:tcPr>
+          <w:p>
+            <w:r>
+              <w:rPr>
+                <w:rFonts w:ascii="Calibri" w:cs="Calibri" w:eastAsia="Calibri" w:hAnsi="Calibri"/>
+                <w:b w:val="false"/>
+                <w:bCs w:val="false"/>
+                <w:color w:val="000000"/>
+                <w:sz w:val="19"/>
+                <w:szCs w:val="19"/>
+              </w:rPr>
+              <w:t xml:space="preserve">1,62 / 2,18</w:t>
+            </w:r>
+          </w:p>
+        </w:tc>
+      </w:tr>
+    </w:tbl>
+    <w:p>
+      <w:pPr>
+        <w:shd w:fill="FCEEEE" w:val="clear"/>
+        <w:spacing w:after="200" w:before="100"/>
+        <w:ind w:left="200"/>
+      </w:pPr>
+      <w:r>
+        <w:rPr>
+          <w:rFonts w:ascii="Calibri" w:cs="Calibri" w:eastAsia="Calibri" w:hAnsi="Calibri"/>
+          <w:i/>
+          <w:iCs/>
+          <w:color w:val="8B1A1A"/>
+          <w:sz w:val="20"/>
+          <w:szCs w:val="20"/>
+        </w:rPr>
+        <w:t xml:space="preserve">⚠ Le marché est déjà bien calibré : suivre simplement le favori n'apporte aucun avantage. Un modèle n'a de valeur que s'il fait mieux que cette probabilité implicite, marge comprise. Un backtest de la martingale (mises 1000/2000/4000/8000 F) sur ces mêmes données a perdu dans les 12 variantes testées (−1 % à −14 % des sommes misées) : aucun système de mise ne crée d'avantage à lui seul.</w:t>
+      </w:r>
+    </w:p>
+    <w:p>
+      <w:pPr>
+        <w:spacing w:after="160"/>
+      </w:pPr>
+      <w:r>
+        <w:rPr>
+          <w:rFonts w:ascii="Calibri" w:cs="Calibri" w:eastAsia="Calibri" w:hAnsi="Calibri"/>
+          <w:b w:val="false"/>
+          <w:bCs w:val="false"/>
+          <w:i w:val="false"/>
+          <w:iCs w:val="false"/>
+        </w:rPr>
+        <w:t xml:space="preserve">Taille d'échantillon nécessaire pour valider un avantage : avec une cote autour de 1,7, l'écart-type du rendement d'un pari est d'environ 0,83. Distinguer un avantage réel de 3 % d'un coup de chance demande donc de l'ordre de 3 000 à 7 000 paris simulés hors entraînement — soit 1 à 3 semaines supplémentaires de validation, le modèle ne pariant que sur une partie des manches.</w:t>
+      </w:r>
+    </w:p>
+    <w:p>
+      <w:pPr>
         <w:pStyle w:val="Heading1"/>
         <w:spacing w:after="200" w:before="400"/>
       </w:pPr>
@@ -3679,6 +4148,83 @@
                 <w:sz w:val="19"/>
                 <w:szCs w:val="19"/>
               </w:rPr>
+              <w:t xml:space="preserve">Après validation d'un avantage</w:t>
+            </w:r>
+          </w:p>
+        </w:tc>
+        <w:tc>
+          <w:tcPr>
+            <w:tcW w:type="dxa" w:w="5800"/>
+            <w:tcMar>
+              <w:top w:type="dxa" w:w="80"/>
+              <w:left w:type="dxa" w:w="100"/>
+              <w:bottom w:type="dxa" w:w="80"/>
+              <w:right w:type="dxa" w:w="100"/>
+            </w:tcMar>
+            <w:vAlign w:val="center"/>
+          </w:tcPr>
+          <w:p>
+            <w:r>
+              <w:rPr>
+                <w:rFonts w:ascii="Calibri" w:cs="Calibri" w:eastAsia="Calibri" w:hAnsi="Calibri"/>
+                <w:b w:val="false"/>
+                <w:bCs w:val="false"/>
+                <w:color w:val="000000"/>
+                <w:sz w:val="19"/>
+                <w:szCs w:val="19"/>
+              </w:rPr>
+              <w:t xml:space="preserve">Prédictions en direct sur un salon Telegram dédié (11), réentraînement encore manuel</w:t>
+            </w:r>
+          </w:p>
+        </w:tc>
+      </w:tr>
+      <w:tr>
+        <w:tc>
+          <w:tcPr>
+            <w:tcW w:type="dxa" w:w="1600"/>
+            <w:tcMar>
+              <w:top w:type="dxa" w:w="80"/>
+              <w:left w:type="dxa" w:w="100"/>
+              <w:bottom w:type="dxa" w:w="80"/>
+              <w:right w:type="dxa" w:w="100"/>
+            </w:tcMar>
+            <w:vAlign w:val="center"/>
+          </w:tcPr>
+          <w:p>
+            <w:r>
+              <w:rPr>
+                <w:rFonts w:ascii="Calibri" w:cs="Calibri" w:eastAsia="Calibri" w:hAnsi="Calibri"/>
+                <w:b w:val="false"/>
+                <w:bCs w:val="false"/>
+                <w:color w:val="000000"/>
+                <w:sz w:val="19"/>
+                <w:szCs w:val="19"/>
+              </w:rPr>
+              <w:t xml:space="preserve">6</w:t>
+            </w:r>
+          </w:p>
+        </w:tc>
+        <w:tc>
+          <w:tcPr>
+            <w:tcW w:type="dxa" w:w="2600"/>
+            <w:tcMar>
+              <w:top w:type="dxa" w:w="80"/>
+              <w:left w:type="dxa" w:w="100"/>
+              <w:bottom w:type="dxa" w:w="80"/>
+              <w:right w:type="dxa" w:w="100"/>
+            </w:tcMar>
+            <w:vAlign w:val="center"/>
+          </w:tcPr>
+          <w:p>
+            <w:r>
+              <w:rPr>
+                <w:rFonts w:ascii="Calibri" w:cs="Calibri" w:eastAsia="Calibri" w:hAnsi="Calibri"/>
+                <w:b w:val="false"/>
+                <w:bCs w:val="false"/>
+                <w:color w:val="000000"/>
+                <w:sz w:val="19"/>
+                <w:szCs w:val="19"/>
+              </w:rPr>
               <w:t xml:space="preserve">Continu ensuite</w:t>
             </w:r>
           </w:p>
@@ -3704,12 +4250,30 @@
                 <w:sz w:val="19"/>
                 <w:szCs w:val="19"/>
               </w:rPr>
-              <w:t xml:space="preserve">Réentraînement hebdomadaire ; validation walk-forward (9) ; surveillance de la dérive par rapport au marché</w:t>
+              <w:t xml:space="preserve">Réentraînement et redéploiement automatiques quotidiens, avec examen de passage champion/challenger (12) ; surveillance de la dérive par rapport au marché</w:t>
             </w:r>
           </w:p>
         </w:tc>
       </w:tr>
     </w:tbl>
+    <w:p>
+      <w:pPr>
+        <w:shd w:fill="FCEEEE" w:val="clear"/>
+        <w:spacing w:after="200" w:before="100"/>
+        <w:ind w:left="200"/>
+      </w:pPr>
+      <w:r>
+        <w:rPr>
+          <w:rFonts w:ascii="Calibri" w:cs="Calibri" w:eastAsia="Calibri" w:hAnsi="Calibri"/>
+          <w:i/>
+          <w:iCs/>
+          <w:color w:val="8B1A1A"/>
+          <w:sz w:val="20"/>
+          <w:szCs w:val="20"/>
+        </w:rPr>
+        <w:t xml:space="preserve">⚠ Calendrier réaliste d'un modèle fiable, s'il existe un signal exploitable : premier verdict vers le 25 septembre 2026 (J+3), modèle complet vers fin octobre - mi-novembre, plus 1 à 3 semaines de validation hors entraînement avant de s'y fier. Il est possible que l'étude conclue à l'absence d'avantage exploitable : ce serait un résultat à part entière.</w:t>
+      </w:r>
+    </w:p>
     <w:p>
       <w:pPr>
         <w:pStyle w:val="Heading1"/>
@@ -3752,7 +4316,245 @@
           <w:bCs/>
           <w:color w:val="8B1A1A"/>
         </w:rPr>
-        <w:t xml:space="preserve">12. Risques et limites</w:t>
+        <w:t xml:space="preserve">12. Réentraînement et redéploiement automatiques quotidiens</w:t>
+      </w:r>
+    </w:p>
+    <w:p>
+      <w:pPr>
+        <w:spacing w:after="160"/>
+      </w:pPr>
+      <w:r>
+        <w:rPr>
+          <w:rFonts w:ascii="Calibri" w:cs="Calibri" w:eastAsia="Calibri" w:hAnsi="Calibri"/>
+          <w:b w:val="false"/>
+          <w:bCs w:val="false"/>
+          <w:i w:val="false"/>
+          <w:iCs w:val="false"/>
+        </w:rPr>
+        <w:t xml:space="preserve">Décidé avec l'utilisateur le 24 septembre 2026. À mettre en place uniquement APRÈS un premier modèle ayant démontré un avantage sur le marché (phase 6 du calendrier) : automatiser le redéploiement d'un modèle qui ne bat pas la cote n'aurait aucun intérêt.</w:t>
+      </w:r>
+    </w:p>
+    <w:p>
+      <w:pPr>
+        <w:shd w:fill="FCEEEE" w:val="clear"/>
+        <w:spacing w:after="200" w:before="100"/>
+        <w:ind w:left="200"/>
+      </w:pPr>
+      <w:r>
+        <w:rPr>
+          <w:rFonts w:ascii="Calibri" w:cs="Calibri" w:eastAsia="Calibri" w:hAnsi="Calibri"/>
+          <w:i/>
+          <w:iCs/>
+          <w:color w:val="8B1A1A"/>
+          <w:sz w:val="20"/>
+          <w:szCs w:val="20"/>
+        </w:rPr>
+        <w:t xml:space="preserve">⚠ Principe non négociable : un nouveau modèle ne remplace JAMAIS automatiquement le modèle en place sans avoir réussi un examen de passage. Un entraînement peut mal tourner (données anormales un jour donné, bug, changement du simulateur) ; un redéploiement aveugle mettrait en production un modèle pire sans que personne ne s'en aperçoive.</w:t>
+      </w:r>
+    </w:p>
+    <w:p>
+      <w:pPr>
+        <w:pStyle w:val="Heading2"/>
+        <w:spacing w:after="150" w:before="300"/>
+      </w:pPr>
+      <w:r>
+        <w:rPr>
+          <w:rFonts w:ascii="Calibri" w:cs="Calibri" w:eastAsia="Calibri" w:hAnsi="Calibri"/>
+          <w:b/>
+          <w:bCs/>
+          <w:color w:val="2F2A2E"/>
+        </w:rPr>
+        <w:t xml:space="preserve">12.1 Déroulement quotidien (champion contre challenger)</w:t>
+      </w:r>
+    </w:p>
+    <w:p>
+      <w:pPr>
+        <w:pStyle w:val="ListParagraph"/>
+        <w:numPr>
+          <w:ilvl w:val="0"/>
+          <w:numId w:val="2"/>
+        </w:numPr>
+        <w:spacing w:after="80"/>
+      </w:pPr>
+      <w:r>
+        <w:rPr>
+          <w:rFonts w:ascii="Calibri" w:cs="Calibri" w:eastAsia="Calibri" w:hAnsi="Calibri"/>
+        </w:rPr>
+        <w:t xml:space="preserve">Chaque jour à heure fixe (ex. 4h00 UTC, après la sauvegarde de 3h00), une tâche cron lance l'entraînement dans un conteneur séparé (profil Docker dédié), jamais dans le conteneur du collecteur.</w:t>
+      </w:r>
+    </w:p>
+    <w:p>
+      <w:pPr>
+        <w:pStyle w:val="ListParagraph"/>
+        <w:numPr>
+          <w:ilvl w:val="0"/>
+          <w:numId w:val="2"/>
+        </w:numPr>
+        <w:spacing w:after="80"/>
+      </w:pPr>
+      <w:r>
+        <w:rPr>
+          <w:rFonts w:ascii="Calibri" w:cs="Calibri" w:eastAsia="Calibri" w:hAnsi="Calibri"/>
+        </w:rPr>
+        <w:t xml:space="preserve">Extraction des données à jour (section 6), entraînement d'un nouveau modèle : le « challenger ».</w:t>
+      </w:r>
+    </w:p>
+    <w:p>
+      <w:pPr>
+        <w:pStyle w:val="ListParagraph"/>
+        <w:numPr>
+          <w:ilvl w:val="0"/>
+          <w:numId w:val="2"/>
+        </w:numPr>
+        <w:spacing w:after="80"/>
+      </w:pPr>
+      <w:r>
+        <w:rPr>
+          <w:rFonts w:ascii="Calibri" w:cs="Calibri" w:eastAsia="Calibri" w:hAnsi="Calibri"/>
+        </w:rPr>
+        <w:t xml:space="preserve">Examen de passage, sur les 1 à 2 derniers jours qu'aucun des deux modèles n'a vus : le challenger doit faire au moins aussi bien que le modèle en place (le « champion »), faire mieux que la probabilité implicite du marché, et réussir les contrôles de cohérence (volume minimal de données, calibration correcte, aucune valeur aberrante).</w:t>
+      </w:r>
+    </w:p>
+    <w:p>
+      <w:pPr>
+        <w:pStyle w:val="ListParagraph"/>
+        <w:numPr>
+          <w:ilvl w:val="0"/>
+          <w:numId w:val="2"/>
+        </w:numPr>
+        <w:spacing w:after="80"/>
+      </w:pPr>
+      <w:r>
+        <w:rPr>
+          <w:rFonts w:ascii="Calibri" w:cs="Calibri" w:eastAsia="Calibri" w:hAnsi="Calibri"/>
+        </w:rPr>
+        <w:t xml:space="preserve">Examen réussi : le modèle est enregistré avec sa date et ses métriques, puis désigné comme modèle actif. Le collecteur le charge seul au match suivant, sans redémarrage ni coupure de service.</w:t>
+      </w:r>
+    </w:p>
+    <w:p>
+      <w:pPr>
+        <w:pStyle w:val="ListParagraph"/>
+        <w:numPr>
+          <w:ilvl w:val="0"/>
+          <w:numId w:val="2"/>
+        </w:numPr>
+        <w:spacing w:after="80"/>
+      </w:pPr>
+      <w:r>
+        <w:rPr>
+          <w:rFonts w:ascii="Calibri" w:cs="Calibri" w:eastAsia="Calibri" w:hAnsi="Calibri"/>
+        </w:rPr>
+        <w:t xml:space="preserve">Examen échoué : le champion reste en place, rien ne change en production.</w:t>
+      </w:r>
+    </w:p>
+    <w:p>
+      <w:pPr>
+        <w:pStyle w:val="ListParagraph"/>
+        <w:numPr>
+          <w:ilvl w:val="0"/>
+          <w:numId w:val="2"/>
+        </w:numPr>
+        <w:spacing w:after="80"/>
+      </w:pPr>
+      <w:r>
+        <w:rPr>
+          <w:rFonts w:ascii="Calibri" w:cs="Calibri" w:eastAsia="Calibri" w:hAnsi="Calibri"/>
+        </w:rPr>
+        <w:t xml:space="preserve">Dans les deux cas, un message sur le canal d'alertes techniques (ex. « Nouveau modèle déployé : log-loss 0,672 → 0,668 » ou « Modèle du jour rejeté, ancien conservé »).</w:t>
+      </w:r>
+    </w:p>
+    <w:p>
+      <w:pPr>
+        <w:pStyle w:val="Heading2"/>
+        <w:spacing w:after="150" w:before="300"/>
+      </w:pPr>
+      <w:r>
+        <w:rPr>
+          <w:rFonts w:ascii="Calibri" w:cs="Calibri" w:eastAsia="Calibri" w:hAnsi="Calibri"/>
+          <w:b/>
+          <w:bCs/>
+          <w:color w:val="2F2A2E"/>
+        </w:rPr>
+        <w:t xml:space="preserve">12.2 Sécurités</w:t>
+      </w:r>
+    </w:p>
+    <w:p>
+      <w:pPr>
+        <w:pStyle w:val="ListParagraph"/>
+        <w:numPr>
+          <w:ilvl w:val="0"/>
+          <w:numId w:val="2"/>
+        </w:numPr>
+        <w:spacing w:after="80"/>
+      </w:pPr>
+      <w:r>
+        <w:rPr>
+          <w:rFonts w:ascii="Calibri" w:cs="Calibri" w:eastAsia="Calibri" w:hAnsi="Calibri"/>
+        </w:rPr>
+        <w:t xml:space="preserve">Historique des versions : les derniers modèles sont conservés ; retour en arrière en une commande, ou automatiquement si la performance réelle se dégrade.</w:t>
+      </w:r>
+    </w:p>
+    <w:p>
+      <w:pPr>
+        <w:pStyle w:val="ListParagraph"/>
+        <w:numPr>
+          <w:ilvl w:val="0"/>
+          <w:numId w:val="2"/>
+        </w:numPr>
+        <w:spacing w:after="80"/>
+      </w:pPr>
+      <w:r>
+        <w:rPr>
+          <w:rFonts w:ascii="Calibri" w:cs="Calibri" w:eastAsia="Calibri" w:hAnsi="Calibri"/>
+        </w:rPr>
+        <w:t xml:space="preserve">Suivi en production : chaque prédiction est enregistrée en base puis comparée au résultat réel ; alerte si le modèle en place perd face au marché plusieurs jours de suite.</w:t>
+      </w:r>
+    </w:p>
+    <w:p>
+      <w:pPr>
+        <w:pStyle w:val="ListParagraph"/>
+        <w:numPr>
+          <w:ilvl w:val="0"/>
+          <w:numId w:val="2"/>
+        </w:numPr>
+        <w:spacing w:after="80"/>
+      </w:pPr>
+      <w:r>
+        <w:rPr>
+          <w:rFonts w:ascii="Calibri" w:cs="Calibri" w:eastAsia="Calibri" w:hAnsi="Calibri"/>
+        </w:rPr>
+        <w:t xml:space="preserve">Isolation : conteneur d'entraînement avec limite de mémoire, incapable de priver Postgres ou le collecteur de ressources. S'il échoue, la production continue avec le modèle actuel : elle n'est jamais laissée sans modèle.</w:t>
+      </w:r>
+    </w:p>
+    <w:p>
+      <w:pPr>
+        <w:pStyle w:val="ListParagraph"/>
+        <w:numPr>
+          <w:ilvl w:val="0"/>
+          <w:numId w:val="2"/>
+        </w:numPr>
+        <w:spacing w:after="80"/>
+      </w:pPr>
+      <w:r>
+        <w:rPr>
+          <w:rFonts w:ascii="Calibri" w:cs="Calibri" w:eastAsia="Calibri" w:hAnsi="Calibri"/>
+        </w:rPr>
+        <w:t xml:space="preserve">Coût : quelques minutes de calcul par jour, largement supporté par le VPS actuel (8 Go, ≈ 580 Mo utilisés). Sur une instance à 1 Go, l'entraînement devrait se faire ailleurs.</w:t>
+      </w:r>
+    </w:p>
+    <w:p>
+      <w:pPr>
+        <w:pStyle w:val="Heading1"/>
+        <w:spacing w:after="200" w:before="400"/>
+      </w:pPr>
+      <w:r>
+        <w:rPr>
+          <w:rFonts w:ascii="Calibri" w:cs="Calibri" w:eastAsia="Calibri" w:hAnsi="Calibri"/>
+          <w:b/>
+          <w:bCs/>
+          <w:color w:val="8B1A1A"/>
+        </w:rPr>
+        <w:t xml:space="preserve">13. Risques et limites</w:t>
       </w:r>
     </w:p>
     <w:p>

</xml_diff>

<commit_message>
Plan d'entraînement : calibration, règle de pari, validation purgée et variables de marché
Intègre au plan ce qui résiste à la lecture des articles partagés par l'utilisateur (sélection
par classwise-ECE d'après Walsh & Joshi, chiffres révisés de la v4 ; purge/embargo et registre
des essais d'après López de Prado ; value bets, mise fixe avant Kelly 1/8), les variables
dynamiques du marché, et les séries récentes marquées « à valider » (Memoire.md §37).

Co-Authored-By: Claude Opus 5.5 <noreply@anthropic.com>
</commit_message>
<xml_diff>
--- a/docs/forecasting/plan_entrainement_mortal_kombat.docx
+++ b/docs/forecasting/plan_entrainement_mortal_kombat.docx
@@ -1716,7 +1716,7 @@
         <w:rPr>
           <w:rFonts w:ascii="Calibri" w:cs="Calibri" w:eastAsia="Calibri" w:hAnsi="Calibri"/>
         </w:rPr>
-        <w:t xml:space="preserve">Historique glissant par combattant (calculé UNIQUEMENT sur les matchs antérieurs à l'instant de la prédiction, jamais sur le match en cours — voir 4.4) : durée moyenne de ses manches, répartition de ses types de finish, nombre de matchs déjà observés</w:t>
+        <w:t xml:space="preserve">Historique glissant par combattant (calculé UNIQUEMENT sur les matchs antérieurs à l'instant de la prédiction, jamais sur le match en cours — voir 4.6) : durée moyenne de ses manches, répartition de ses types de finish, nombre de matchs déjà observés</w:t>
       </w:r>
     </w:p>
     <w:p>
@@ -1873,7 +1873,165 @@
           <w:bCs/>
           <w:color w:val="2F2A2E"/>
         </w:rPr>
-        <w:t xml:space="preserve">4.4 Règle impérative anti-fuite (data leakage)</w:t>
+        <w:t xml:space="preserve">4.4 Variables dynamiques du marché (ajoutées le 24 septembre 2026)</w:t>
+      </w:r>
+    </w:p>
+    <w:p>
+      <w:pPr>
+        <w:spacing w:after="160"/>
+      </w:pPr>
+      <w:r>
+        <w:rPr>
+          <w:rFonts w:ascii="Calibri" w:cs="Calibri" w:eastAsia="Calibri" w:hAnsi="Calibri"/>
+          <w:b w:val="false"/>
+          <w:bCs w:val="false"/>
+          <w:i w:val="false"/>
+          <w:iCs w:val="false"/>
+        </w:rPr>
+        <w:t xml:space="preserve">Le collecteur enregistre chaque changement de cote (heure serveur, ligne, suspension, disparition du marché), relevé toutes les ≈ 5 s. On peut en tirer, pour chaque manche, calculé uniquement sur la période AVANT la prédiction :</w:t>
+      </w:r>
+    </w:p>
+    <w:p>
+      <w:pPr>
+        <w:pStyle w:val="ListParagraph"/>
+        <w:numPr>
+          <w:ilvl w:val="0"/>
+          <w:numId w:val="2"/>
+        </w:numPr>
+        <w:spacing w:after="80"/>
+      </w:pPr>
+      <w:r>
+        <w:rPr>
+          <w:rFonts w:ascii="Calibri" w:cs="Calibri" w:eastAsia="Calibri" w:hAnsi="Calibri"/>
+        </w:rPr>
+        <w:t xml:space="preserve">Probabilité implicite de chaque issue, marge retirée : (1/cote_i) / Σ(1/cote_j). Jamais 1/cote brut, qui contient la marge du bookmaker.</w:t>
+      </w:r>
+    </w:p>
+    <w:p>
+      <w:pPr>
+        <w:pStyle w:val="ListParagraph"/>
+        <w:numPr>
+          <w:ilvl w:val="0"/>
+          <w:numId w:val="2"/>
+        </w:numPr>
+        <w:spacing w:after="80"/>
+      </w:pPr>
+      <w:r>
+        <w:rPr>
+          <w:rFonts w:ascii="Calibri" w:cs="Calibri" w:eastAsia="Calibri" w:hAnsi="Calibri"/>
+        </w:rPr>
+        <w:t xml:space="preserve">Marge du bookmaker sur le marché concerné (Σ 1/cote − 1) et son évolution avant la manche. L'idée qu'une hausse de marge « annonce » quelque chose n'est pas démontrée : c'est une variable à tester, pas une règle.</w:t>
+      </w:r>
+    </w:p>
+    <w:p>
+      <w:pPr>
+        <w:pStyle w:val="ListParagraph"/>
+        <w:numPr>
+          <w:ilvl w:val="0"/>
+          <w:numId w:val="2"/>
+        </w:numPr>
+        <w:spacing w:after="80"/>
+      </w:pPr>
+      <w:r>
+        <w:rPr>
+          <w:rFonts w:ascii="Calibri" w:cs="Calibri" w:eastAsia="Calibri" w:hAnsi="Calibri"/>
+        </w:rPr>
+        <w:t xml:space="preserve">Changement de ligne (ex. durée de manche « plus/moins de 45 s » devenue « 47 s ») et son sens.</w:t>
+      </w:r>
+    </w:p>
+    <w:p>
+      <w:pPr>
+        <w:pStyle w:val="ListParagraph"/>
+        <w:numPr>
+          <w:ilvl w:val="0"/>
+          <w:numId w:val="2"/>
+        </w:numPr>
+        <w:spacing w:after="80"/>
+      </w:pPr>
+      <w:r>
+        <w:rPr>
+          <w:rFonts w:ascii="Calibri" w:cs="Calibri" w:eastAsia="Calibri" w:hAnsi="Calibri"/>
+        </w:rPr>
+        <w:t xml:space="preserve">Mouvement de la cote avant la manche : tendance (hausse/baisse), amplitude, nombre de changements, suspensions récentes (le « clignotement rouge/vert » observé sur le site).</w:t>
+      </w:r>
+    </w:p>
+    <w:p>
+      <w:pPr>
+        <w:shd w:fill="FCEEEE" w:val="clear"/>
+        <w:spacing w:after="200" w:before="100"/>
+        <w:ind w:left="200"/>
+      </w:pPr>
+      <w:r>
+        <w:rPr>
+          <w:rFonts w:ascii="Calibri" w:cs="Calibri" w:eastAsia="Calibri" w:hAnsi="Calibri"/>
+          <w:i/>
+          <w:iCs/>
+          <w:color w:val="8B1A1A"/>
+          <w:sz w:val="20"/>
+          <w:szCs w:val="20"/>
+        </w:rPr>
+        <w:t xml:space="preserve">⚠ AI Table Tennis : les cotes de transition « 1,85 / 1,85 » qui apparaissent en cours de jeu (≈ 13 % des changements, source principale du site) ne doivent jamais être traitées comme une vraie cote. Les filtrer, ou les signaler par une variable dédiée.</w:t>
+      </w:r>
+    </w:p>
+    <w:p>
+      <w:pPr>
+        <w:pStyle w:val="Heading2"/>
+        <w:spacing w:after="150" w:before="300"/>
+      </w:pPr>
+      <w:r>
+        <w:rPr>
+          <w:rFonts w:ascii="Calibri" w:cs="Calibri" w:eastAsia="Calibri" w:hAnsi="Calibri"/>
+          <w:b/>
+          <w:bCs/>
+          <w:color w:val="2F2A2E"/>
+        </w:rPr>
+        <w:t xml:space="preserve">4.5 Séries récentes (statut : à valider, probablement sans effet)</w:t>
+      </w:r>
+    </w:p>
+    <w:p>
+      <w:pPr>
+        <w:pStyle w:val="ListParagraph"/>
+        <w:numPr>
+          <w:ilvl w:val="0"/>
+          <w:numId w:val="2"/>
+        </w:numPr>
+        <w:spacing w:after="80"/>
+      </w:pPr>
+      <w:r>
+        <w:rPr>
+          <w:rFonts w:ascii="Calibri" w:cs="Calibri" w:eastAsia="Calibri" w:hAnsi="Calibri"/>
+        </w:rPr>
+        <w:t xml:space="preserve">Proportion d'issues « Plus » (ou de victoires du favori, de Fatality…) sur les 3, 6 et 12 dernières heures, et écart entre ces issues et ce que les cotes prévoyaient.</w:t>
+      </w:r>
+    </w:p>
+    <w:p>
+      <w:pPr>
+        <w:spacing w:after="160"/>
+      </w:pPr>
+      <w:r>
+        <w:rPr>
+          <w:rFonts w:ascii="Calibri" w:cs="Calibri" w:eastAsia="Calibri" w:hAnsi="Calibri"/>
+          <w:b w:val="false"/>
+          <w:bCs w:val="false"/>
+          <w:i w:val="false"/>
+          <w:iCs w:val="false"/>
+        </w:rPr>
+        <w:t xml:space="preserve">L'hypothèse sous-jacente, un « cycle de compensation » du générateur, est le même raisonnement que la martingale. Les données disponibles ne la soutiennent pas : sur 21 302 sets AI Table Tennis, le vainqueur d'un set gagne le suivant dans 50,7 % (Prague) et 49,7 % (Goa) des cas. Ces variables sont peu coûteuses à tester ; elles ne sont conservées que si la validation hors entraînement montre une amélioration réelle, en tenant compte du nombre d'essais (section 9).</w:t>
+      </w:r>
+    </w:p>
+    <w:p>
+      <w:pPr>
+        <w:pStyle w:val="Heading2"/>
+        <w:spacing w:after="150" w:before="300"/>
+      </w:pPr>
+      <w:r>
+        <w:rPr>
+          <w:rFonts w:ascii="Calibri" w:cs="Calibri" w:eastAsia="Calibri" w:hAnsi="Calibri"/>
+          <w:b/>
+          <w:bCs/>
+          <w:color w:val="2F2A2E"/>
+        </w:rPr>
+        <w:t xml:space="preserve">4.6 Règle impérative anti-fuite (data leakage)</w:t>
       </w:r>
     </w:p>
     <w:p>
@@ -2686,7 +2844,7 @@
           <w:bCs/>
           <w:color w:val="2F2A2E"/>
         </w:rPr>
-        <w:t xml:space="preserve">6.3 Agrégats glissants par combattant (calcul causal, voir 4.4)</w:t>
+        <w:t xml:space="preserve">6.3 Agrégats glissants par combattant (calcul causal, voir 4.6)</w:t>
       </w:r>
     </w:p>
     <w:p>
@@ -2960,6 +3118,102 @@
           <w:rFonts w:ascii="Calibri" w:cs="Calibri" w:eastAsia="Calibri" w:hAnsi="Calibri"/>
         </w:rPr>
         <w:t xml:space="preserve">Alternative si le volume de classes rares reste insuffisant après plusieurs semaines (section 5) : regrouper Babality/Friendship/Animality/Hara-Kiri en une classe « finish spécial rare » pour un modèle en production plus robuste, tout en gardant un modèle de recherche séparé, plus fin, à mesure que les données rares s'accumulent.</w:t>
+      </w:r>
+    </w:p>
+    <w:p>
+      <w:pPr>
+        <w:pStyle w:val="Heading2"/>
+        <w:spacing w:after="150" w:before="300"/>
+      </w:pPr>
+      <w:r>
+        <w:rPr>
+          <w:rFonts w:ascii="Calibri" w:cs="Calibri" w:eastAsia="Calibri" w:hAnsi="Calibri"/>
+          <w:b/>
+          <w:bCs/>
+          <w:color w:val="2F2A2E"/>
+        </w:rPr>
+        <w:t xml:space="preserve">7.3 Critère de sélection : la calibration, pas la précision</w:t>
+      </w:r>
+    </w:p>
+    <w:p>
+      <w:pPr>
+        <w:spacing w:after="160"/>
+      </w:pPr>
+      <w:r>
+        <w:rPr>
+          <w:rFonts w:ascii="Calibri" w:cs="Calibri" w:eastAsia="Calibri" w:hAnsi="Calibri"/>
+          <w:b w:val="false"/>
+          <w:bCs w:val="false"/>
+          <w:i w:val="false"/>
+          <w:iCs w:val="false"/>
+        </w:rPr>
+        <w:t xml:space="preserve">Référence : Walsh &amp; Joshi (Université de Bath), « Machine learning for sports betting: should model selection be based on accuracy or calibration? », Machine Learning with Applications, 2024 (arXiv:2303.06021 v4). Sur des paris NBA simulés sur une saison, avec découpage strictement temporel, le modèle choisi pour sa calibration rapporte +34,69 % en moyenne, contre −35,17 % pour celui choisi pour sa précision — alors que ce dernier était légèrement plus précis (64,62 % contre 64,27 %). En mise Kelly 1/8, le modèle choisi pour sa précision perd 75,9 %.</w:t>
+      </w:r>
+    </w:p>
+    <w:p>
+      <w:pPr>
+        <w:shd w:fill="FCEEEE" w:val="clear"/>
+        <w:spacing w:after="200" w:before="100"/>
+        <w:ind w:left="200"/>
+      </w:pPr>
+      <w:r>
+        <w:rPr>
+          <w:rFonts w:ascii="Calibri" w:cs="Calibri" w:eastAsia="Calibri" w:hAnsi="Calibri"/>
+          <w:i/>
+          <w:iCs/>
+          <w:color w:val="8B1A1A"/>
+          <w:sz w:val="20"/>
+          <w:szCs w:val="20"/>
+        </w:rPr>
+        <w:t xml:space="preserve">⚠ Les chiffres « 110 % contre 2,9 % » qui circulent viennent de la première version (2023) de cet article, révisée depuis. Limites reconnues par les auteurs : une seule saison de paris, seuil de 80 % d'intervalles remplis choisi arbitrairement, sport humain où le marché peut se tromper. Sur nos jeux virtuels, le marché est déjà bien calibré (section 8.3) : la calibration est NÉCESSAIRE mais pas SUFFISANTE, le modèle doit aussi mieux discriminer que la cote.</w:t>
+      </w:r>
+    </w:p>
+    <w:p>
+      <w:pPr>
+        <w:pStyle w:val="ListParagraph"/>
+        <w:numPr>
+          <w:ilvl w:val="0"/>
+          <w:numId w:val="2"/>
+        </w:numPr>
+        <w:spacing w:after="80"/>
+      </w:pPr>
+      <w:r>
+        <w:rPr>
+          <w:rFonts w:ascii="Calibri" w:cs="Calibri" w:eastAsia="Calibri" w:hAnsi="Calibri"/>
+        </w:rPr>
+        <w:t xml:space="preserve">Métriques de sélection : log-loss et classwise-ECE (erreur de calibration par classe, 20 intervalles, avec au moins 80 % d'intervalles non vides pour empêcher un modèle de se réfugier autour de la moyenne). Jamais la précision (accuracy) seule.</w:t>
+      </w:r>
+    </w:p>
+    <w:p>
+      <w:pPr>
+        <w:pStyle w:val="ListParagraph"/>
+        <w:numPr>
+          <w:ilvl w:val="0"/>
+          <w:numId w:val="2"/>
+        </w:numPr>
+        <w:spacing w:after="80"/>
+      </w:pPr>
+      <w:r>
+        <w:rPr>
+          <w:rFonts w:ascii="Calibri" w:cs="Calibri" w:eastAsia="Calibri" w:hAnsi="Calibri"/>
+        </w:rPr>
+        <w:t xml:space="preserve">Le même critère sert au choix des variables (sélection séquentielle), au réglage des hyperparamètres (optimisation bayésienne) et à l'examen de passage quotidien champion/challenger (section 12).</w:t>
+      </w:r>
+    </w:p>
+    <w:p>
+      <w:pPr>
+        <w:pStyle w:val="ListParagraph"/>
+        <w:numPr>
+          <w:ilvl w:val="0"/>
+          <w:numId w:val="2"/>
+        </w:numPr>
+        <w:spacing w:after="80"/>
+      </w:pPr>
+      <w:r>
+        <w:rPr>
+          <w:rFonts w:ascii="Calibri" w:cs="Calibri" w:eastAsia="Calibri" w:hAnsi="Calibri"/>
+        </w:rPr>
+        <w:t xml:space="preserve">Modèles d'arbres (LightGBM/XGBoost) plutôt que réseaux récurrents (LSTM) : sur des données tabulaires de cette taille, ils sont en général plus robustes et bien moins coûteux.</w:t>
       </w:r>
     </w:p>
     <w:p>
@@ -3590,6 +3844,85 @@
     </w:p>
     <w:p>
       <w:pPr>
+        <w:pStyle w:val="Heading2"/>
+        <w:spacing w:after="150" w:before="300"/>
+      </w:pPr>
+      <w:r>
+        <w:rPr>
+          <w:rFonts w:ascii="Calibri" w:cs="Calibri" w:eastAsia="Calibri" w:hAnsi="Calibri"/>
+          <w:b/>
+          <w:bCs/>
+          <w:color w:val="2F2A2E"/>
+        </w:rPr>
+        <w:t xml:space="preserve">8.4 Règle de pari et de mise</w:t>
+      </w:r>
+    </w:p>
+    <w:p>
+      <w:pPr>
+        <w:pStyle w:val="ListParagraph"/>
+        <w:numPr>
+          <w:ilvl w:val="0"/>
+          <w:numId w:val="2"/>
+        </w:numPr>
+        <w:spacing w:after="80"/>
+      </w:pPr>
+      <w:r>
+        <w:rPr>
+          <w:rFonts w:ascii="Calibri" w:cs="Calibri" w:eastAsia="Calibri" w:hAnsi="Calibri"/>
+        </w:rPr>
+        <w:t xml:space="preserve">Uniquement des value bets : probabilité du modèle supérieure à la probabilité implicite du marché MARGE RETIRÉE, au-delà d'un seuil minimal d'avantage fixé sur la validation (pas sur le test).</w:t>
+      </w:r>
+    </w:p>
+    <w:p>
+      <w:pPr>
+        <w:pStyle w:val="ListParagraph"/>
+        <w:numPr>
+          <w:ilvl w:val="0"/>
+          <w:numId w:val="2"/>
+        </w:numPr>
+        <w:spacing w:after="80"/>
+      </w:pPr>
+      <w:r>
+        <w:rPr>
+          <w:rFonts w:ascii="Calibri" w:cs="Calibri" w:eastAsia="Calibri" w:hAnsi="Calibri"/>
+        </w:rPr>
+        <w:t xml:space="preserve">Mise fixe d'abord. Kelly fractionné (1/8) seulement une fois la calibration prouvée hors entraînement : Kelly amplifie toute erreur de calibration (−75,9 % dans l'étude de Bath).</w:t>
+      </w:r>
+    </w:p>
+    <w:p>
+      <w:pPr>
+        <w:pStyle w:val="ListParagraph"/>
+        <w:numPr>
+          <w:ilvl w:val="0"/>
+          <w:numId w:val="2"/>
+        </w:numPr>
+        <w:spacing w:after="80"/>
+      </w:pPr>
+      <w:r>
+        <w:rPr>
+          <w:rFonts w:ascii="Calibri" w:cs="Calibri" w:eastAsia="Calibri" w:hAnsi="Calibri"/>
+        </w:rPr>
+        <w:t xml:space="preserve">Aucune progression selon les pertes précédentes (martingale) : les backtests sur nos données la montrent perdante dans toutes les variantes testées, la perte correspondant à la marge du bookmaker.</w:t>
+      </w:r>
+    </w:p>
+    <w:p>
+      <w:pPr>
+        <w:pStyle w:val="ListParagraph"/>
+        <w:numPr>
+          <w:ilvl w:val="0"/>
+          <w:numId w:val="2"/>
+        </w:numPr>
+        <w:spacing w:after="80"/>
+      </w:pPr>
+      <w:r>
+        <w:rPr>
+          <w:rFonts w:ascii="Calibri" w:cs="Calibri" w:eastAsia="Calibri" w:hAnsi="Calibri"/>
+        </w:rPr>
+        <w:t xml:space="preserve">Backtest toujours avec la cote réellement disponible au moment du pari (dernière cote avant fermeture du marché), jamais une cote postérieure ; cotes de transition 1,85/1,85 d'AI Table Tennis exclues.</w:t>
+      </w:r>
+    </w:p>
+    <w:p>
+      <w:pPr>
         <w:pStyle w:val="Heading1"/>
         <w:spacing w:after="200" w:before="400"/>
       </w:pPr>
@@ -3679,6 +4012,38 @@
           <w:iCs w:val="false"/>
         </w:rPr>
         <w:t xml:space="preserve">Cette discipline détecte tôt un problème de dérive (le fournisseur change son générateur) ou de surapprentissage, plutôt que de le découvrir une fois le modèle mis en production.</w:t>
+      </w:r>
+    </w:p>
+    <w:p>
+      <w:pPr>
+        <w:pStyle w:val="ListParagraph"/>
+        <w:numPr>
+          <w:ilvl w:val="0"/>
+          <w:numId w:val="2"/>
+        </w:numPr>
+        <w:spacing w:after="80"/>
+      </w:pPr>
+      <w:r>
+        <w:rPr>
+          <w:rFonts w:ascii="Calibri" w:cs="Calibri" w:eastAsia="Calibri" w:hAnsi="Calibri"/>
+        </w:rPr>
+        <w:t xml:space="preserve">Purge et embargo (López de Prado, Advances in Financial Machine Learning) : retirer de l'entraînement les matchs chevauchant la période de validation, et laisser un court intervalle vide entre les deux, pour qu'aucune information corrélée (même match, historique glissant) ne passe de l'un à l'autre.</w:t>
+      </w:r>
+    </w:p>
+    <w:p>
+      <w:pPr>
+        <w:pStyle w:val="ListParagraph"/>
+        <w:numPr>
+          <w:ilvl w:val="0"/>
+          <w:numId w:val="2"/>
+        </w:numPr>
+        <w:spacing w:after="80"/>
+      </w:pPr>
+      <w:r>
+        <w:rPr>
+          <w:rFonts w:ascii="Calibri" w:cs="Calibri" w:eastAsia="Calibri" w:hAnsi="Calibri"/>
+        </w:rPr>
+        <w:t xml:space="preserve">Nombre d'essais : chaque variante testée (variables, hyperparamètres, règles de pari) augmente la probabilité qu'une d'elles paraisse rentable par pur hasard. Tenir un registre des essais et exiger une marge de sécurité croissante avec ce nombre avant de conclure à un avantage réel.</w:t>
       </w:r>
     </w:p>
     <w:p>
@@ -4412,7 +4777,7 @@
         <w:rPr>
           <w:rFonts w:ascii="Calibri" w:cs="Calibri" w:eastAsia="Calibri" w:hAnsi="Calibri"/>
         </w:rPr>
-        <w:t xml:space="preserve">Examen de passage, sur les 1 à 2 derniers jours qu'aucun des deux modèles n'a vus : le challenger doit faire au moins aussi bien que le modèle en place (le « champion »), faire mieux que la probabilité implicite du marché, et réussir les contrôles de cohérence (volume minimal de données, calibration correcte, aucune valeur aberrante).</w:t>
+        <w:t xml:space="preserve">Examen de passage, sur les 1 à 2 derniers jours qu'aucun des deux modèles n'a vus : le challenger doit faire au moins aussi bien que le modèle en place (le « champion »), faire mieux que la probabilité implicite du marché, et réussir les contrôles de cohérence (volume minimal de données, log-loss et classwise-ECE au moins aussi bons que le champion — section 7.3 —, aucune valeur aberrante).</w:t>
       </w:r>
     </w:p>
     <w:p>
@@ -4618,7 +4983,7 @@
         <w:rPr>
           <w:rFonts w:ascii="Calibri" w:cs="Calibri" w:eastAsia="Calibri" w:hAnsi="Calibri"/>
         </w:rPr>
-        <w:t xml:space="preserve">Fuite de données (data leakage) : rappelée en 4.4 et 6.4 car c'est l'erreur la plus fréquente et la plus difficile à détecter a posteriori — toujours vérifier qu'aucune variable ne "voit" le futur par rapport à la manche prédite.</w:t>
+        <w:t xml:space="preserve">Fuite de données (data leakage) : rappelée en 4.6 et 6.4 car c'est l'erreur la plus fréquente et la plus difficile à détecter a posteriori — toujours vérifier qu'aucune variable ne "voit" le futur par rapport à la manche prédite.</w:t>
       </w:r>
     </w:p>
     <w:p>
@@ -4635,6 +5000,69 @@
           <w:rFonts w:ascii="Calibri" w:cs="Calibri" w:eastAsia="Calibri" w:hAnsi="Calibri"/>
         </w:rPr>
         <w:t xml:space="preserve">Champ WT de round_results, dont la signification reste non établie (Memoire.md, section 15) : à exclure des variables tant qu'il n'est pas mieux compris, plutôt que de l'utiliser à l'aveugle.</w:t>
+      </w:r>
+    </w:p>
+    <w:p>
+      <w:pPr>
+        <w:pStyle w:val="Heading1"/>
+        <w:spacing w:after="200" w:before="400"/>
+      </w:pPr>
+      <w:r>
+        <w:rPr>
+          <w:rFonts w:ascii="Calibri" w:cs="Calibri" w:eastAsia="Calibri" w:hAnsi="Calibri"/>
+          <w:b/>
+          <w:bCs/>
+          <w:color w:val="8B1A1A"/>
+        </w:rPr>
+        <w:t xml:space="preserve">Annexe — références</w:t>
+      </w:r>
+    </w:p>
+    <w:p>
+      <w:pPr>
+        <w:pStyle w:val="ListParagraph"/>
+        <w:numPr>
+          <w:ilvl w:val="0"/>
+          <w:numId w:val="2"/>
+        </w:numPr>
+        <w:spacing w:after="80"/>
+      </w:pPr>
+      <w:r>
+        <w:rPr>
+          <w:rFonts w:ascii="Calibri" w:cs="Calibri" w:eastAsia="Calibri" w:hAnsi="Calibri"/>
+        </w:rPr>
+        <w:t xml:space="preserve">Walsh C., Joshi A. (2024), « Machine learning for sports betting: should model selection be based on accuracy or calibration? », Machine Learning with Applications — arXiv:2303.06021 (v4). Retenu : sélection par calibration (classwise-ECE), value bets, mise fixe avant Kelly fractionné.</w:t>
+      </w:r>
+    </w:p>
+    <w:p>
+      <w:pPr>
+        <w:pStyle w:val="ListParagraph"/>
+        <w:numPr>
+          <w:ilvl w:val="0"/>
+          <w:numId w:val="2"/>
+        </w:numPr>
+        <w:spacing w:after="80"/>
+      </w:pPr>
+      <w:r>
+        <w:rPr>
+          <w:rFonts w:ascii="Calibri" w:cs="Calibri" w:eastAsia="Calibri" w:hAnsi="Calibri"/>
+        </w:rPr>
+        <w:t xml:space="preserve">« XGBoost Learning of Dynamic Wager Placement for In-Play Betting » (Université de Bristol), arXiv:2401.06086. Données entièrement simulées (courses fictives) ; les auteurs déconseillent d'en tirer des paris réels. Retenu seulement : combiner état du jeu en direct et état du marché comme variables.</w:t>
+      </w:r>
+    </w:p>
+    <w:p>
+      <w:pPr>
+        <w:pStyle w:val="ListParagraph"/>
+        <w:numPr>
+          <w:ilvl w:val="0"/>
+          <w:numId w:val="2"/>
+        </w:numPr>
+        <w:spacing w:after="80"/>
+      </w:pPr>
+      <w:r>
+        <w:rPr>
+          <w:rFonts w:ascii="Calibri" w:cs="Calibri" w:eastAsia="Calibri" w:hAnsi="Calibri"/>
+        </w:rPr>
+        <w:t xml:space="preserve">López de Prado M., « Advances in Financial Machine Learning ». Retenu : validation croisée purgée avec embargo, prise en compte du nombre d'essais. Non retenu : Triple-Barrier Labels, conçus pour des séries boursières continues (nos issues sont déjà naturellement étiquetées).</w:t>
       </w:r>
     </w:p>
     <w:p>

</xml_diff>